<commit_message>
small update for documentation
</commit_message>
<xml_diff>
--- a/Documentation/Requirements Document - Artist Land.docx
+++ b/Documentation/Requirements Document - Artist Land.docx
@@ -7445,6 +7445,39 @@
     </w:p>
     <w:p>
       <w:pPr>
+        <w:ind w:left="1440"/>
+        <w:jc w:val="both"/>
+        <w:rPr>
+          <w:rFonts w:ascii="Times New Roman" w:eastAsia="Times New Roman" w:hAnsi="Times New Roman" w:cs="Times New Roman"/>
+          <w:sz w:val="24"/>
+          <w:szCs w:val="24"/>
+        </w:rPr>
+      </w:pPr>
+    </w:p>
+    <w:p>
+      <w:pPr>
+        <w:ind w:left="1440"/>
+        <w:jc w:val="both"/>
+        <w:rPr>
+          <w:rFonts w:ascii="Times New Roman" w:eastAsia="Times New Roman" w:hAnsi="Times New Roman" w:cs="Times New Roman"/>
+          <w:sz w:val="24"/>
+          <w:szCs w:val="24"/>
+        </w:rPr>
+      </w:pPr>
+    </w:p>
+    <w:p>
+      <w:pPr>
+        <w:ind w:left="1440"/>
+        <w:jc w:val="both"/>
+        <w:rPr>
+          <w:rFonts w:ascii="Times New Roman" w:eastAsia="Times New Roman" w:hAnsi="Times New Roman" w:cs="Times New Roman"/>
+          <w:sz w:val="24"/>
+          <w:szCs w:val="24"/>
+        </w:rPr>
+      </w:pPr>
+    </w:p>
+    <w:p>
+      <w:pPr>
         <w:numPr>
           <w:ilvl w:val="0"/>
           <w:numId w:val="12"/>
@@ -7467,6 +7500,7 @@
           <w:sz w:val="28"/>
           <w:szCs w:val="28"/>
         </w:rPr>
+        <w:lastRenderedPageBreak/>
         <w:t>Planificare și livrabile</w:t>
       </w:r>
     </w:p>
@@ -7504,7 +7538,6 @@
           <w:sz w:val="24"/>
           <w:szCs w:val="24"/>
         </w:rPr>
-        <w:lastRenderedPageBreak/>
         <w:t xml:space="preserve">Sprint 1 (20 Octombrie – 30 Decembrie 2024) </w:t>
       </w:r>
     </w:p>
@@ -13713,7 +13746,7 @@
               </wp:anchor>
             </w:drawing>
           </mc:Choice>
-          <mc:Fallback xmlns:sl="http://schemas.openxmlformats.org/schemaLibrary/2006/main" xmlns:a="http://schemas.openxmlformats.org/drawingml/2006/main" xmlns:pic="http://schemas.openxmlformats.org/drawingml/2006/picture" xmlns:c="http://schemas.openxmlformats.org/drawingml/2006/chart" xmlns:lc="http://schemas.openxmlformats.org/drawingml/2006/lockedCanvas" xmlns:dgm="http://schemas.openxmlformats.org/drawingml/2006/diagram" xmlns="http://schemas.microsoft.com/office/tasks/2019/documenttasks" xmlns:cr="http://schemas.microsoft.com/office/comments/2020/reactions">
+          <mc:Fallback xmlns:cr="http://schemas.microsoft.com/office/comments/2020/reactions" xmlns="http://schemas.microsoft.com/office/tasks/2019/documenttasks" xmlns:dgm="http://schemas.openxmlformats.org/drawingml/2006/diagram" xmlns:lc="http://schemas.openxmlformats.org/drawingml/2006/lockedCanvas" xmlns:c="http://schemas.openxmlformats.org/drawingml/2006/chart" xmlns:pic="http://schemas.openxmlformats.org/drawingml/2006/picture" xmlns:a="http://schemas.openxmlformats.org/drawingml/2006/main" xmlns:sl="http://schemas.openxmlformats.org/schemaLibrary/2006/main">
             <w:drawing>
               <wp:anchor allowOverlap="1" behindDoc="0" distB="114300" distT="114300" distL="114300" distR="114300" hidden="0" layoutInCell="1" locked="0" relativeHeight="0" simplePos="0">
                 <wp:simplePos x="0" y="0"/>
@@ -13807,7 +13840,7 @@
               </wp:anchor>
             </w:drawing>
           </mc:Choice>
-          <mc:Fallback xmlns:sl="http://schemas.openxmlformats.org/schemaLibrary/2006/main" xmlns:a="http://schemas.openxmlformats.org/drawingml/2006/main" xmlns:pic="http://schemas.openxmlformats.org/drawingml/2006/picture" xmlns:c="http://schemas.openxmlformats.org/drawingml/2006/chart" xmlns:lc="http://schemas.openxmlformats.org/drawingml/2006/lockedCanvas" xmlns:dgm="http://schemas.openxmlformats.org/drawingml/2006/diagram" xmlns="http://schemas.microsoft.com/office/tasks/2019/documenttasks" xmlns:cr="http://schemas.microsoft.com/office/comments/2020/reactions">
+          <mc:Fallback xmlns:cr="http://schemas.microsoft.com/office/comments/2020/reactions" xmlns="http://schemas.microsoft.com/office/tasks/2019/documenttasks" xmlns:dgm="http://schemas.openxmlformats.org/drawingml/2006/diagram" xmlns:lc="http://schemas.openxmlformats.org/drawingml/2006/lockedCanvas" xmlns:c="http://schemas.openxmlformats.org/drawingml/2006/chart" xmlns:pic="http://schemas.openxmlformats.org/drawingml/2006/picture" xmlns:a="http://schemas.openxmlformats.org/drawingml/2006/main" xmlns:sl="http://schemas.openxmlformats.org/schemaLibrary/2006/main">
             <w:drawing>
               <wp:anchor allowOverlap="1" behindDoc="0" distB="114300" distT="114300" distL="114300" distR="114300" hidden="0" layoutInCell="1" locked="0" relativeHeight="0" simplePos="0">
                 <wp:simplePos x="0" y="0"/>
@@ -13901,7 +13934,7 @@
               </wp:anchor>
             </w:drawing>
           </mc:Choice>
-          <mc:Fallback xmlns:sl="http://schemas.openxmlformats.org/schemaLibrary/2006/main" xmlns:a="http://schemas.openxmlformats.org/drawingml/2006/main" xmlns:pic="http://schemas.openxmlformats.org/drawingml/2006/picture" xmlns:c="http://schemas.openxmlformats.org/drawingml/2006/chart" xmlns:lc="http://schemas.openxmlformats.org/drawingml/2006/lockedCanvas" xmlns:dgm="http://schemas.openxmlformats.org/drawingml/2006/diagram" xmlns="http://schemas.microsoft.com/office/tasks/2019/documenttasks" xmlns:cr="http://schemas.microsoft.com/office/comments/2020/reactions">
+          <mc:Fallback xmlns:cr="http://schemas.microsoft.com/office/comments/2020/reactions" xmlns="http://schemas.microsoft.com/office/tasks/2019/documenttasks" xmlns:dgm="http://schemas.openxmlformats.org/drawingml/2006/diagram" xmlns:lc="http://schemas.openxmlformats.org/drawingml/2006/lockedCanvas" xmlns:c="http://schemas.openxmlformats.org/drawingml/2006/chart" xmlns:pic="http://schemas.openxmlformats.org/drawingml/2006/picture" xmlns:a="http://schemas.openxmlformats.org/drawingml/2006/main" xmlns:sl="http://schemas.openxmlformats.org/schemaLibrary/2006/main">
             <w:drawing>
               <wp:anchor allowOverlap="1" behindDoc="0" distB="114300" distT="114300" distL="114300" distR="114300" hidden="0" layoutInCell="1" locked="0" relativeHeight="0" simplePos="0">
                 <wp:simplePos x="0" y="0"/>
@@ -13995,7 +14028,7 @@
               </wp:anchor>
             </w:drawing>
           </mc:Choice>
-          <mc:Fallback xmlns:sl="http://schemas.openxmlformats.org/schemaLibrary/2006/main" xmlns:a="http://schemas.openxmlformats.org/drawingml/2006/main" xmlns:pic="http://schemas.openxmlformats.org/drawingml/2006/picture" xmlns:c="http://schemas.openxmlformats.org/drawingml/2006/chart" xmlns:lc="http://schemas.openxmlformats.org/drawingml/2006/lockedCanvas" xmlns:dgm="http://schemas.openxmlformats.org/drawingml/2006/diagram" xmlns="http://schemas.microsoft.com/office/tasks/2019/documenttasks" xmlns:cr="http://schemas.microsoft.com/office/comments/2020/reactions">
+          <mc:Fallback xmlns:cr="http://schemas.microsoft.com/office/comments/2020/reactions" xmlns="http://schemas.microsoft.com/office/tasks/2019/documenttasks" xmlns:dgm="http://schemas.openxmlformats.org/drawingml/2006/diagram" xmlns:lc="http://schemas.openxmlformats.org/drawingml/2006/lockedCanvas" xmlns:c="http://schemas.openxmlformats.org/drawingml/2006/chart" xmlns:pic="http://schemas.openxmlformats.org/drawingml/2006/picture" xmlns:a="http://schemas.openxmlformats.org/drawingml/2006/main" xmlns:sl="http://schemas.openxmlformats.org/schemaLibrary/2006/main">
             <w:drawing>
               <wp:anchor allowOverlap="1" behindDoc="0" distB="114300" distT="114300" distL="114300" distR="114300" hidden="0" layoutInCell="1" locked="0" relativeHeight="0" simplePos="0">
                 <wp:simplePos x="0" y="0"/>
@@ -14089,7 +14122,7 @@
               </wp:anchor>
             </w:drawing>
           </mc:Choice>
-          <mc:Fallback xmlns:sl="http://schemas.openxmlformats.org/schemaLibrary/2006/main" xmlns:a="http://schemas.openxmlformats.org/drawingml/2006/main" xmlns:pic="http://schemas.openxmlformats.org/drawingml/2006/picture" xmlns:c="http://schemas.openxmlformats.org/drawingml/2006/chart" xmlns:lc="http://schemas.openxmlformats.org/drawingml/2006/lockedCanvas" xmlns:dgm="http://schemas.openxmlformats.org/drawingml/2006/diagram" xmlns="http://schemas.microsoft.com/office/tasks/2019/documenttasks" xmlns:cr="http://schemas.microsoft.com/office/comments/2020/reactions">
+          <mc:Fallback xmlns:cr="http://schemas.microsoft.com/office/comments/2020/reactions" xmlns="http://schemas.microsoft.com/office/tasks/2019/documenttasks" xmlns:dgm="http://schemas.openxmlformats.org/drawingml/2006/diagram" xmlns:lc="http://schemas.openxmlformats.org/drawingml/2006/lockedCanvas" xmlns:c="http://schemas.openxmlformats.org/drawingml/2006/chart" xmlns:pic="http://schemas.openxmlformats.org/drawingml/2006/picture" xmlns:a="http://schemas.openxmlformats.org/drawingml/2006/main" xmlns:sl="http://schemas.openxmlformats.org/schemaLibrary/2006/main">
             <w:drawing>
               <wp:anchor allowOverlap="1" behindDoc="0" distB="114300" distT="114300" distL="114300" distR="114300" hidden="0" layoutInCell="1" locked="0" relativeHeight="0" simplePos="0">
                 <wp:simplePos x="0" y="0"/>
@@ -14183,7 +14216,7 @@
               </wp:anchor>
             </w:drawing>
           </mc:Choice>
-          <mc:Fallback xmlns:sl="http://schemas.openxmlformats.org/schemaLibrary/2006/main" xmlns:a="http://schemas.openxmlformats.org/drawingml/2006/main" xmlns:pic="http://schemas.openxmlformats.org/drawingml/2006/picture" xmlns:c="http://schemas.openxmlformats.org/drawingml/2006/chart" xmlns:lc="http://schemas.openxmlformats.org/drawingml/2006/lockedCanvas" xmlns:dgm="http://schemas.openxmlformats.org/drawingml/2006/diagram" xmlns="http://schemas.microsoft.com/office/tasks/2019/documenttasks" xmlns:cr="http://schemas.microsoft.com/office/comments/2020/reactions">
+          <mc:Fallback xmlns:cr="http://schemas.microsoft.com/office/comments/2020/reactions" xmlns="http://schemas.microsoft.com/office/tasks/2019/documenttasks" xmlns:dgm="http://schemas.openxmlformats.org/drawingml/2006/diagram" xmlns:lc="http://schemas.openxmlformats.org/drawingml/2006/lockedCanvas" xmlns:c="http://schemas.openxmlformats.org/drawingml/2006/chart" xmlns:pic="http://schemas.openxmlformats.org/drawingml/2006/picture" xmlns:a="http://schemas.openxmlformats.org/drawingml/2006/main" xmlns:sl="http://schemas.openxmlformats.org/schemaLibrary/2006/main">
             <w:drawing>
               <wp:anchor allowOverlap="1" behindDoc="0" distB="114300" distT="114300" distL="114300" distR="114300" hidden="0" layoutInCell="1" locked="0" relativeHeight="0" simplePos="0">
                 <wp:simplePos x="0" y="0"/>
@@ -14277,7 +14310,7 @@
               </wp:anchor>
             </w:drawing>
           </mc:Choice>
-          <mc:Fallback xmlns:sl="http://schemas.openxmlformats.org/schemaLibrary/2006/main" xmlns:a="http://schemas.openxmlformats.org/drawingml/2006/main" xmlns:pic="http://schemas.openxmlformats.org/drawingml/2006/picture" xmlns:c="http://schemas.openxmlformats.org/drawingml/2006/chart" xmlns:lc="http://schemas.openxmlformats.org/drawingml/2006/lockedCanvas" xmlns:dgm="http://schemas.openxmlformats.org/drawingml/2006/diagram" xmlns="http://schemas.microsoft.com/office/tasks/2019/documenttasks" xmlns:cr="http://schemas.microsoft.com/office/comments/2020/reactions">
+          <mc:Fallback xmlns:cr="http://schemas.microsoft.com/office/comments/2020/reactions" xmlns="http://schemas.microsoft.com/office/tasks/2019/documenttasks" xmlns:dgm="http://schemas.openxmlformats.org/drawingml/2006/diagram" xmlns:lc="http://schemas.openxmlformats.org/drawingml/2006/lockedCanvas" xmlns:c="http://schemas.openxmlformats.org/drawingml/2006/chart" xmlns:pic="http://schemas.openxmlformats.org/drawingml/2006/picture" xmlns:a="http://schemas.openxmlformats.org/drawingml/2006/main" xmlns:sl="http://schemas.openxmlformats.org/schemaLibrary/2006/main">
             <w:drawing>
               <wp:anchor allowOverlap="1" behindDoc="0" distB="114300" distT="114300" distL="114300" distR="114300" hidden="0" layoutInCell="1" locked="0" relativeHeight="0" simplePos="0">
                 <wp:simplePos x="0" y="0"/>
@@ -14371,7 +14404,7 @@
               </wp:anchor>
             </w:drawing>
           </mc:Choice>
-          <mc:Fallback xmlns:sl="http://schemas.openxmlformats.org/schemaLibrary/2006/main" xmlns:a="http://schemas.openxmlformats.org/drawingml/2006/main" xmlns:pic="http://schemas.openxmlformats.org/drawingml/2006/picture" xmlns:c="http://schemas.openxmlformats.org/drawingml/2006/chart" xmlns:lc="http://schemas.openxmlformats.org/drawingml/2006/lockedCanvas" xmlns:dgm="http://schemas.openxmlformats.org/drawingml/2006/diagram" xmlns="http://schemas.microsoft.com/office/tasks/2019/documenttasks" xmlns:cr="http://schemas.microsoft.com/office/comments/2020/reactions">
+          <mc:Fallback xmlns:cr="http://schemas.microsoft.com/office/comments/2020/reactions" xmlns="http://schemas.microsoft.com/office/tasks/2019/documenttasks" xmlns:dgm="http://schemas.openxmlformats.org/drawingml/2006/diagram" xmlns:lc="http://schemas.openxmlformats.org/drawingml/2006/lockedCanvas" xmlns:c="http://schemas.openxmlformats.org/drawingml/2006/chart" xmlns:pic="http://schemas.openxmlformats.org/drawingml/2006/picture" xmlns:a="http://schemas.openxmlformats.org/drawingml/2006/main" xmlns:sl="http://schemas.openxmlformats.org/schemaLibrary/2006/main">
             <w:drawing>
               <wp:anchor allowOverlap="1" behindDoc="0" distB="114300" distT="114300" distL="114300" distR="114300" hidden="0" layoutInCell="1" locked="0" relativeHeight="0" simplePos="0">
                 <wp:simplePos x="0" y="0"/>
@@ -14465,7 +14498,7 @@
               </wp:anchor>
             </w:drawing>
           </mc:Choice>
-          <mc:Fallback xmlns:sl="http://schemas.openxmlformats.org/schemaLibrary/2006/main" xmlns:a="http://schemas.openxmlformats.org/drawingml/2006/main" xmlns:pic="http://schemas.openxmlformats.org/drawingml/2006/picture" xmlns:c="http://schemas.openxmlformats.org/drawingml/2006/chart" xmlns:lc="http://schemas.openxmlformats.org/drawingml/2006/lockedCanvas" xmlns:dgm="http://schemas.openxmlformats.org/drawingml/2006/diagram" xmlns="http://schemas.microsoft.com/office/tasks/2019/documenttasks" xmlns:cr="http://schemas.microsoft.com/office/comments/2020/reactions">
+          <mc:Fallback xmlns:cr="http://schemas.microsoft.com/office/comments/2020/reactions" xmlns="http://schemas.microsoft.com/office/tasks/2019/documenttasks" xmlns:dgm="http://schemas.openxmlformats.org/drawingml/2006/diagram" xmlns:lc="http://schemas.openxmlformats.org/drawingml/2006/lockedCanvas" xmlns:c="http://schemas.openxmlformats.org/drawingml/2006/chart" xmlns:pic="http://schemas.openxmlformats.org/drawingml/2006/picture" xmlns:a="http://schemas.openxmlformats.org/drawingml/2006/main" xmlns:sl="http://schemas.openxmlformats.org/schemaLibrary/2006/main">
             <w:drawing>
               <wp:anchor allowOverlap="1" behindDoc="0" distB="114300" distT="114300" distL="114300" distR="114300" hidden="0" layoutInCell="1" locked="0" relativeHeight="0" simplePos="0">
                 <wp:simplePos x="0" y="0"/>
@@ -14618,7 +14651,7 @@
               </wp:anchor>
             </w:drawing>
           </mc:Choice>
-          <mc:Fallback xmlns:sl="http://schemas.openxmlformats.org/schemaLibrary/2006/main" xmlns:a="http://schemas.openxmlformats.org/drawingml/2006/main" xmlns:pic="http://schemas.openxmlformats.org/drawingml/2006/picture" xmlns:c="http://schemas.openxmlformats.org/drawingml/2006/chart" xmlns:lc="http://schemas.openxmlformats.org/drawingml/2006/lockedCanvas" xmlns:dgm="http://schemas.openxmlformats.org/drawingml/2006/diagram" xmlns="http://schemas.microsoft.com/office/tasks/2019/documenttasks" xmlns:cr="http://schemas.microsoft.com/office/comments/2020/reactions">
+          <mc:Fallback xmlns:cr="http://schemas.microsoft.com/office/comments/2020/reactions" xmlns="http://schemas.microsoft.com/office/tasks/2019/documenttasks" xmlns:dgm="http://schemas.openxmlformats.org/drawingml/2006/diagram" xmlns:lc="http://schemas.openxmlformats.org/drawingml/2006/lockedCanvas" xmlns:c="http://schemas.openxmlformats.org/drawingml/2006/chart" xmlns:pic="http://schemas.openxmlformats.org/drawingml/2006/picture" xmlns:a="http://schemas.openxmlformats.org/drawingml/2006/main" xmlns:sl="http://schemas.openxmlformats.org/schemaLibrary/2006/main">
             <w:drawing>
               <wp:anchor allowOverlap="1" behindDoc="0" distB="114300" distT="114300" distL="114300" distR="114300" hidden="0" layoutInCell="1" locked="0" relativeHeight="0" simplePos="0">
                 <wp:simplePos x="0" y="0"/>
@@ -14712,7 +14745,7 @@
               </wp:anchor>
             </w:drawing>
           </mc:Choice>
-          <mc:Fallback xmlns:sl="http://schemas.openxmlformats.org/schemaLibrary/2006/main" xmlns:a="http://schemas.openxmlformats.org/drawingml/2006/main" xmlns:pic="http://schemas.openxmlformats.org/drawingml/2006/picture" xmlns:c="http://schemas.openxmlformats.org/drawingml/2006/chart" xmlns:lc="http://schemas.openxmlformats.org/drawingml/2006/lockedCanvas" xmlns:dgm="http://schemas.openxmlformats.org/drawingml/2006/diagram" xmlns="http://schemas.microsoft.com/office/tasks/2019/documenttasks" xmlns:cr="http://schemas.microsoft.com/office/comments/2020/reactions">
+          <mc:Fallback xmlns:cr="http://schemas.microsoft.com/office/comments/2020/reactions" xmlns="http://schemas.microsoft.com/office/tasks/2019/documenttasks" xmlns:dgm="http://schemas.openxmlformats.org/drawingml/2006/diagram" xmlns:lc="http://schemas.openxmlformats.org/drawingml/2006/lockedCanvas" xmlns:c="http://schemas.openxmlformats.org/drawingml/2006/chart" xmlns:pic="http://schemas.openxmlformats.org/drawingml/2006/picture" xmlns:a="http://schemas.openxmlformats.org/drawingml/2006/main" xmlns:sl="http://schemas.openxmlformats.org/schemaLibrary/2006/main">
             <w:drawing>
               <wp:anchor allowOverlap="1" behindDoc="0" distB="114300" distT="114300" distL="114300" distR="114300" hidden="0" layoutInCell="1" locked="0" relativeHeight="0" simplePos="0">
                 <wp:simplePos x="0" y="0"/>
@@ -14806,7 +14839,7 @@
               </wp:anchor>
             </w:drawing>
           </mc:Choice>
-          <mc:Fallback xmlns:sl="http://schemas.openxmlformats.org/schemaLibrary/2006/main" xmlns:a="http://schemas.openxmlformats.org/drawingml/2006/main" xmlns:pic="http://schemas.openxmlformats.org/drawingml/2006/picture" xmlns:c="http://schemas.openxmlformats.org/drawingml/2006/chart" xmlns:lc="http://schemas.openxmlformats.org/drawingml/2006/lockedCanvas" xmlns:dgm="http://schemas.openxmlformats.org/drawingml/2006/diagram" xmlns="http://schemas.microsoft.com/office/tasks/2019/documenttasks" xmlns:cr="http://schemas.microsoft.com/office/comments/2020/reactions">
+          <mc:Fallback xmlns:cr="http://schemas.microsoft.com/office/comments/2020/reactions" xmlns="http://schemas.microsoft.com/office/tasks/2019/documenttasks" xmlns:dgm="http://schemas.openxmlformats.org/drawingml/2006/diagram" xmlns:lc="http://schemas.openxmlformats.org/drawingml/2006/lockedCanvas" xmlns:c="http://schemas.openxmlformats.org/drawingml/2006/chart" xmlns:pic="http://schemas.openxmlformats.org/drawingml/2006/picture" xmlns:a="http://schemas.openxmlformats.org/drawingml/2006/main" xmlns:sl="http://schemas.openxmlformats.org/schemaLibrary/2006/main">
             <w:drawing>
               <wp:anchor allowOverlap="1" behindDoc="0" distB="114300" distT="114300" distL="114300" distR="114300" hidden="0" layoutInCell="1" locked="0" relativeHeight="0" simplePos="0">
                 <wp:simplePos x="0" y="0"/>
@@ -14988,7 +15021,7 @@
               </wp:anchor>
             </w:drawing>
           </mc:Choice>
-          <mc:Fallback xmlns:sl="http://schemas.openxmlformats.org/schemaLibrary/2006/main" xmlns:a="http://schemas.openxmlformats.org/drawingml/2006/main" xmlns:pic="http://schemas.openxmlformats.org/drawingml/2006/picture" xmlns:c="http://schemas.openxmlformats.org/drawingml/2006/chart" xmlns:lc="http://schemas.openxmlformats.org/drawingml/2006/lockedCanvas" xmlns:dgm="http://schemas.openxmlformats.org/drawingml/2006/diagram" xmlns="http://schemas.microsoft.com/office/tasks/2019/documenttasks" xmlns:cr="http://schemas.microsoft.com/office/comments/2020/reactions">
+          <mc:Fallback xmlns:cr="http://schemas.microsoft.com/office/comments/2020/reactions" xmlns="http://schemas.microsoft.com/office/tasks/2019/documenttasks" xmlns:dgm="http://schemas.openxmlformats.org/drawingml/2006/diagram" xmlns:lc="http://schemas.openxmlformats.org/drawingml/2006/lockedCanvas" xmlns:c="http://schemas.openxmlformats.org/drawingml/2006/chart" xmlns:pic="http://schemas.openxmlformats.org/drawingml/2006/picture" xmlns:a="http://schemas.openxmlformats.org/drawingml/2006/main" xmlns:sl="http://schemas.openxmlformats.org/schemaLibrary/2006/main">
             <w:drawing>
               <wp:anchor allowOverlap="1" behindDoc="0" distB="114300" distT="114300" distL="114300" distR="114300" hidden="0" layoutInCell="1" locked="0" relativeHeight="0" simplePos="0">
                 <wp:simplePos x="0" y="0"/>
@@ -15082,7 +15115,7 @@
               </wp:anchor>
             </w:drawing>
           </mc:Choice>
-          <mc:Fallback xmlns:sl="http://schemas.openxmlformats.org/schemaLibrary/2006/main" xmlns:a="http://schemas.openxmlformats.org/drawingml/2006/main" xmlns:pic="http://schemas.openxmlformats.org/drawingml/2006/picture" xmlns:c="http://schemas.openxmlformats.org/drawingml/2006/chart" xmlns:lc="http://schemas.openxmlformats.org/drawingml/2006/lockedCanvas" xmlns:dgm="http://schemas.openxmlformats.org/drawingml/2006/diagram" xmlns="http://schemas.microsoft.com/office/tasks/2019/documenttasks" xmlns:cr="http://schemas.microsoft.com/office/comments/2020/reactions">
+          <mc:Fallback xmlns:cr="http://schemas.microsoft.com/office/comments/2020/reactions" xmlns="http://schemas.microsoft.com/office/tasks/2019/documenttasks" xmlns:dgm="http://schemas.openxmlformats.org/drawingml/2006/diagram" xmlns:lc="http://schemas.openxmlformats.org/drawingml/2006/lockedCanvas" xmlns:c="http://schemas.openxmlformats.org/drawingml/2006/chart" xmlns:pic="http://schemas.openxmlformats.org/drawingml/2006/picture" xmlns:a="http://schemas.openxmlformats.org/drawingml/2006/main" xmlns:sl="http://schemas.openxmlformats.org/schemaLibrary/2006/main">
             <w:drawing>
               <wp:anchor allowOverlap="1" behindDoc="0" distB="114300" distT="114300" distL="114300" distR="114300" hidden="0" layoutInCell="1" locked="0" relativeHeight="0" simplePos="0">
                 <wp:simplePos x="0" y="0"/>
@@ -15235,7 +15268,7 @@
               </wp:anchor>
             </w:drawing>
           </mc:Choice>
-          <mc:Fallback xmlns:sl="http://schemas.openxmlformats.org/schemaLibrary/2006/main" xmlns:a="http://schemas.openxmlformats.org/drawingml/2006/main" xmlns:pic="http://schemas.openxmlformats.org/drawingml/2006/picture" xmlns:c="http://schemas.openxmlformats.org/drawingml/2006/chart" xmlns:lc="http://schemas.openxmlformats.org/drawingml/2006/lockedCanvas" xmlns:dgm="http://schemas.openxmlformats.org/drawingml/2006/diagram" xmlns="http://schemas.microsoft.com/office/tasks/2019/documenttasks" xmlns:cr="http://schemas.microsoft.com/office/comments/2020/reactions">
+          <mc:Fallback xmlns:cr="http://schemas.microsoft.com/office/comments/2020/reactions" xmlns="http://schemas.microsoft.com/office/tasks/2019/documenttasks" xmlns:dgm="http://schemas.openxmlformats.org/drawingml/2006/diagram" xmlns:lc="http://schemas.openxmlformats.org/drawingml/2006/lockedCanvas" xmlns:c="http://schemas.openxmlformats.org/drawingml/2006/chart" xmlns:pic="http://schemas.openxmlformats.org/drawingml/2006/picture" xmlns:a="http://schemas.openxmlformats.org/drawingml/2006/main" xmlns:sl="http://schemas.openxmlformats.org/schemaLibrary/2006/main">
             <w:drawing>
               <wp:anchor allowOverlap="1" behindDoc="0" distB="114300" distT="114300" distL="114300" distR="114300" hidden="0" layoutInCell="1" locked="0" relativeHeight="0" simplePos="0">
                 <wp:simplePos x="0" y="0"/>

</xml_diff>

<commit_message>
Update Requirements Document - Artist Land.docx
</commit_message>
<xml_diff>
--- a/Documentation/Requirements Document - Artist Land.docx
+++ b/Documentation/Requirements Document - Artist Land.docx
@@ -5000,6 +5000,14 @@
           <w:szCs w:val="24"/>
         </w:rPr>
         <w:t>responsiv</w:t>
+      </w:r>
+      <w:r>
+        <w:rPr>
+          <w:rFonts w:ascii="Times New Roman" w:eastAsia="Times New Roman" w:hAnsi="Times New Roman" w:cs="Times New Roman"/>
+          <w:sz w:val="24"/>
+          <w:szCs w:val="24"/>
+        </w:rPr>
+        <w:t>e</w:t>
       </w:r>
       <w:proofErr w:type="spellEnd"/>
       <w:r>

</xml_diff>